<commit_message>
qa: complete full visual review for plain reports
</commit_message>
<xml_diff>
--- a/05_交付物/通俗细分版_2026-08-07/01_学术写作引用与出版/01-01_论文整体规划与流程管理/01-01_论文整体规划与流程管理_GitHub技能调研.docx
+++ b/05_交付物/通俗细分版_2026-08-07/01_学术写作引用与出版/01-01_论文整体规划与流程管理/01-01_论文整体规划与流程管理_GitHub技能调研.docx
@@ -620,6 +620,7 @@
     </w:p>
     <w:p>
       <w:pPr>
+        <w:keepNext/>
         <w:keepLines w:val="0"/>
       </w:pPr>
       <w:r>
@@ -646,16 +647,20 @@
     <w:p>
       <w:pPr>
         <w:pStyle w:val="Heading3"/>
+        <w:keepNext w:val="0"/>
+        <w:keepLines/>
+        <w:spacing w:before="120" w:after="0" w:line="240" w:lineRule="auto"/>
       </w:pPr>
       <w:r>
-        <w:t>技术追溯</w:t>
+        <w:rPr>
+          <w:rFonts w:ascii="Calibri" w:hAnsi="Calibri" w:eastAsia="Microsoft YaHei"/>
+          <w:b/>
+          <w:i w:val="0"/>
+          <w:color w:val="1F4D78"/>
+          <w:sz w:val="22"/>
+        </w:rPr>
+        <w:t>技术追溯｜</w:t>
       </w:r>
-    </w:p>
-    <w:p>
-      <w:pPr>
-        <w:keepLines/>
-        <w:spacing w:before="0" w:after="0" w:line="240" w:lineRule="auto"/>
-      </w:pPr>
       <w:r>
         <w:rPr>
           <w:rFonts w:ascii="Calibri" w:hAnsi="Calibri" w:eastAsia="Microsoft YaHei"/>
@@ -1339,6 +1344,7 @@
     </w:p>
     <w:p>
       <w:pPr>
+        <w:keepNext/>
         <w:keepLines w:val="0"/>
       </w:pPr>
       <w:r>
@@ -1365,16 +1371,20 @@
     <w:p>
       <w:pPr>
         <w:pStyle w:val="Heading3"/>
+        <w:keepNext w:val="0"/>
+        <w:keepLines/>
+        <w:spacing w:before="120" w:after="0" w:line="240" w:lineRule="auto"/>
       </w:pPr>
       <w:r>
-        <w:t>技术追溯</w:t>
+        <w:rPr>
+          <w:rFonts w:ascii="Calibri" w:hAnsi="Calibri" w:eastAsia="Microsoft YaHei"/>
+          <w:b/>
+          <w:i w:val="0"/>
+          <w:color w:val="1F4D78"/>
+          <w:sz w:val="22"/>
+        </w:rPr>
+        <w:t>技术追溯｜</w:t>
       </w:r>
-    </w:p>
-    <w:p>
-      <w:pPr>
-        <w:keepLines/>
-        <w:spacing w:before="0" w:after="0" w:line="240" w:lineRule="auto"/>
-      </w:pPr>
       <w:r>
         <w:rPr>
           <w:rFonts w:ascii="Calibri" w:hAnsi="Calibri" w:eastAsia="Microsoft YaHei"/>

</xml_diff>